<commit_message>
docs: add Figure 6 GitHub PR screenshot to official report
</commit_message>
<xml_diff>
--- a/Lab03_Akishev_2406IS.docx
+++ b/Lab03_Akishev_2406IS.docx
@@ -23,7 +23,7 @@
     </w:p>
     <w:p>
       <w:pPr>
-        <w:spacing w:before="800" w:after="200"/>
+        <w:spacing w:before="720" w:after="200"/>
         <w:jc w:val="center"/>
       </w:pPr>
       <w:r>
@@ -40,14 +40,14 @@
         <w:rPr>
           <w:rFonts w:ascii="Calibri" w:hAnsi="Calibri"/>
           <w:color w:val="334155"/>
-          <w:sz w:val="28"/>
+          <w:sz w:val="27"/>
         </w:rPr>
         <w:t>Application Configuration: Profiles, application.yml, External Parameters, @ConfigurationProperties and Auto-Configuration Diagnostics</w:t>
       </w:r>
     </w:p>
     <w:p>
       <w:pPr>
-        <w:spacing w:before="1200" w:after="1200" w:line="312" w:lineRule="auto"/>
+        <w:spacing w:before="1000" w:after="1000" w:line="312" w:lineRule="auto"/>
       </w:pPr>
       <w:r>
         <w:rPr>
@@ -110,7 +110,7 @@
           <w:rFonts w:ascii="Calibri" w:hAnsi="Calibri"/>
           <w:sz w:val="23"/>
         </w:rPr>
-        <w:t>IS-2406</w:t>
+        <w:t>IS-2406 (2406IS)</w:t>
         <w:br/>
       </w:r>
       <w:r>
@@ -167,6 +167,22 @@
           <w:b/>
           <w:sz w:val="23"/>
         </w:rPr>
+        <w:t xml:space="preserve">Pull Request: </w:t>
+      </w:r>
+      <w:r>
+        <w:rPr>
+          <w:rFonts w:ascii="Calibri" w:hAnsi="Calibri"/>
+          <w:sz w:val="23"/>
+        </w:rPr>
+        <w:t>https://github.com/adilkhanakishev/spring-lab-01/pull/2</w:t>
+        <w:br/>
+      </w:r>
+      <w:r>
+        <w:rPr>
+          <w:rFonts w:ascii="Calibri" w:hAnsi="Calibri"/>
+          <w:b/>
+          <w:sz w:val="23"/>
+        </w:rPr>
         <w:t xml:space="preserve">Date: </w:t>
       </w:r>
       <w:r>
@@ -180,7 +196,7 @@
     </w:p>
     <w:p>
       <w:pPr>
-        <w:spacing w:before="1600"/>
+        <w:spacing w:before="1200"/>
         <w:jc w:val="center"/>
       </w:pPr>
       <w:r>
@@ -839,7 +855,7 @@
           <w:color w:val="1E1E1E"/>
           <w:sz w:val="22"/>
         </w:rPr>
-        <w:t>• spring-boot-configuration-processor — generates additional-spring-configuration-metadata.json at compile time, enabling IDE autocompletion and documentation for custom app.* properties.</w:t>
+        <w:t>• spring-boot-configuration-processor — generates metadata at compile time, enabling IDE autocompletion for custom app.* properties.</w:t>
       </w:r>
     </w:p>
     <w:p>
@@ -1072,7 +1088,7 @@
           <w:color w:val="1E1E1E"/>
           <w:sz w:val="22"/>
         </w:rPr>
-        <w:t>To prove that configuration validation executes immediately at startup before any requests or business beans are invoked, the parameter app.mail.retry-count was temporarily set to 99 (exceeding the @Max(10) constraint).</w:t>
+        <w:t>To prove that configuration validation executes immediately at startup before any requests or business beans are invoked, the parameter app.mail.retry-count was temporarily set to 99 (violating the @Max(10) constraint).</w:t>
       </w:r>
     </w:p>
     <w:p>
@@ -1093,7 +1109,7 @@
           <w:color w:val="1E1E1E"/>
           <w:sz w:val="22"/>
         </w:rPr>
-        <w:t>Start command:</w:t>
+        <w:t>Startup command:</w:t>
       </w:r>
     </w:p>
     <w:tbl>
@@ -1148,74 +1164,64 @@
           <w:color w:val="1E1E1E"/>
           <w:sz w:val="22"/>
         </w:rPr>
-        <w:t>Observed Startup Failure Console Output:</w:t>
+        <w:t>Observed Startup Failure in IntelliJ IDEA Run Console:</w:t>
       </w:r>
     </w:p>
-    <w:tbl>
-      <w:tblPr>
-        <w:tblW w:type="auto" w:w="0"/>
+    <w:p>
+      <w:pPr>
+        <w:keepNext/>
+        <w:spacing w:before="160" w:after="40"/>
         <w:jc w:val="center"/>
-        <w:tblLook w:firstColumn="1" w:firstRow="1" w:lastColumn="0" w:lastRow="0" w:noHBand="0" w:noVBand="1" w:val="04A0"/>
-      </w:tblPr>
-      <w:tblGrid>
-        <w:gridCol w:w="9936"/>
-      </w:tblGrid>
-      <w:tr>
-        <w:tc>
-          <w:tcPr>
-            <w:tcW w:type="dxa" w:w="9936"/>
-            <w:shd w:fill="F3F4F6"/>
-            <w:tcMar>
-              <w:top w:w="120" w:type="dxa"/>
-              <w:bottom w:w="120" w:type="dxa"/>
-              <w:left w:w="160" w:type="dxa"/>
-              <w:right w:w="160" w:type="dxa"/>
-            </w:tcMar>
-          </w:tcPr>
-          <w:p>
-            <w:pPr>
-              <w:spacing w:before="40" w:after="40" w:line="252" w:lineRule="auto"/>
-            </w:pPr>
-            <w:r>
-              <w:rPr>
-                <w:rFonts w:ascii="Consolas" w:hAnsi="Consolas"/>
-                <w:color w:val="1E293B"/>
-                <w:sz w:val="19"/>
-              </w:rPr>
-              <w:t>***************************</w:t>
-              <w:br/>
-              <w:t>APPLICATION FAILED TO START</w:t>
-              <w:br/>
-              <w:t>***************************</w:t>
-              <w:br/>
-              <w:br/>
-              <w:t>Description:</w:t>
-              <w:br/>
-              <w:br/>
-              <w:t>Binding to target kz.iitu.springlab.config.AppProperties failed:</w:t>
-              <w:br/>
-              <w:br/>
-              <w:t xml:space="preserve">    Property: app.mail.retryCount</w:t>
-              <w:br/>
-              <w:t xml:space="preserve">    Value: "99"</w:t>
-              <w:br/>
-              <w:t xml:space="preserve">    Reason: должно быть не больше 10</w:t>
-              <w:br/>
-              <w:br/>
-              <w:br/>
-              <w:t>Action:</w:t>
-              <w:br/>
-              <w:br/>
-              <w:t>Update your application's configuration</w:t>
-            </w:r>
-          </w:p>
-        </w:tc>
-      </w:tr>
-    </w:tbl>
+      </w:pPr>
+      <w:r>
+        <w:drawing>
+          <wp:inline xmlns:a="http://schemas.openxmlformats.org/drawingml/2006/main" xmlns:pic="http://schemas.openxmlformats.org/drawingml/2006/picture">
+            <wp:extent cx="5577840" cy="2968675"/>
+            <wp:docPr id="1" name="Picture 1"/>
+            <wp:cNvGraphicFramePr>
+              <a:graphicFrameLocks noChangeAspect="1"/>
+            </wp:cNvGraphicFramePr>
+            <a:graphic>
+              <a:graphicData uri="http://schemas.openxmlformats.org/drawingml/2006/picture">
+                <pic:pic>
+                  <pic:nvPicPr>
+                    <pic:cNvPr id="0" name="media_1790526962016.png"/>
+                    <pic:cNvPicPr/>
+                  </pic:nvPicPr>
+                  <pic:blipFill>
+                    <a:blip r:embed="rId9"/>
+                    <a:stretch>
+                      <a:fillRect/>
+                    </a:stretch>
+                  </pic:blipFill>
+                  <pic:spPr>
+                    <a:xfrm>
+                      <a:off x="0" y="0"/>
+                      <a:ext cx="5577840" cy="2968675"/>
+                    </a:xfrm>
+                    <a:prstGeom prst="rect"/>
+                  </pic:spPr>
+                </pic:pic>
+              </a:graphicData>
+            </a:graphic>
+          </wp:inline>
+        </w:drawing>
+      </w:r>
+    </w:p>
     <w:p>
       <w:pPr>
-        <w:spacing w:after="80"/>
-      </w:pPr>
+        <w:spacing w:before="40" w:after="160"/>
+        <w:jc w:val="center"/>
+      </w:pPr>
+      <w:r>
+        <w:rPr>
+          <w:rFonts w:ascii="Calibri" w:hAnsi="Calibri"/>
+          <w:i/>
+          <w:color w:val="505050"/>
+          <w:sz w:val="19"/>
+        </w:rPr>
+        <w:t>Figure 1: Application startup validation failure in IntelliJ IDEA Run console (app.mail.retryCount = 99)</w:t>
+      </w:r>
     </w:p>
     <w:p>
       <w:pPr>
@@ -1585,78 +1591,61 @@
         <w:t>1. Default Run (No Profile Active, port 8080):</w:t>
       </w:r>
     </w:p>
-    <w:tbl>
-      <w:tblPr>
-        <w:tblW w:type="auto" w:w="0"/>
+    <w:p>
+      <w:pPr>
+        <w:keepNext/>
+        <w:spacing w:before="160" w:after="40"/>
         <w:jc w:val="center"/>
-        <w:tblLook w:firstColumn="1" w:firstRow="1" w:lastColumn="0" w:lastRow="0" w:noHBand="0" w:noVBand="1" w:val="04A0"/>
-      </w:tblPr>
-      <w:tblGrid>
-        <w:gridCol w:w="9936"/>
-      </w:tblGrid>
-      <w:tr>
-        <w:tc>
-          <w:tcPr>
-            <w:tcW w:type="dxa" w:w="9936"/>
-            <w:shd w:fill="F3F4F6"/>
-            <w:tcMar>
-              <w:top w:w="120" w:type="dxa"/>
-              <w:bottom w:w="120" w:type="dxa"/>
-              <w:left w:w="160" w:type="dxa"/>
-              <w:right w:w="160" w:type="dxa"/>
-            </w:tcMar>
-          </w:tcPr>
-          <w:p>
-            <w:pPr>
-              <w:spacing w:before="40" w:after="40" w:line="252" w:lineRule="auto"/>
-            </w:pPr>
-            <w:r>
-              <w:rPr>
-                <w:rFonts w:ascii="Consolas" w:hAnsi="Consolas"/>
-                <w:color w:val="1E293B"/>
-                <w:sz w:val="19"/>
-              </w:rPr>
-              <w:t>GET http://localhost:8080/api/lab3/config</w:t>
-              <w:br/>
-              <w:t>HTTP/1.1 200 OK</w:t>
-              <w:br/>
-              <w:t>Content-Type: application/json</w:t>
-              <w:br/>
-              <w:br/>
-              <w:t>{</w:t>
-              <w:br/>
-              <w:t xml:space="preserve">  "owner": "Akishev Adilkhan",</w:t>
-              <w:br/>
-              <w:t xml:space="preserve">  "group": "IS-2406",</w:t>
-              <w:br/>
-              <w:t xml:space="preserve">  "mailFrom": "no-reply@iitu.kz",</w:t>
-              <w:br/>
-              <w:t xml:space="preserve">  "mailRetryCount": 3,</w:t>
-              <w:br/>
-              <w:t xml:space="preserve">  "mailTimeout": "PT5S",</w:t>
-              <w:br/>
-              <w:t xml:space="preserve">  "mailEnabled": true,</w:t>
-              <w:br/>
-              <w:t xml:space="preserve">  "paginationDefaultSize": 20,</w:t>
-              <w:br/>
-              <w:t xml:space="preserve">  "paginationMaxSize": 100,</w:t>
-              <w:br/>
-              <w:t xml:space="preserve">  "serverPort": "8080",</w:t>
-              <w:br/>
-              <w:t xml:space="preserve">  "activeProfiles": [],</w:t>
-              <w:br/>
-              <w:t xml:space="preserve">  "banner": "no profile is active"</w:t>
-              <w:br/>
-              <w:t>}</w:t>
-            </w:r>
-          </w:p>
-        </w:tc>
-      </w:tr>
-    </w:tbl>
+      </w:pPr>
+      <w:r>
+        <w:drawing>
+          <wp:inline xmlns:a="http://schemas.openxmlformats.org/drawingml/2006/main" xmlns:pic="http://schemas.openxmlformats.org/drawingml/2006/picture">
+            <wp:extent cx="5577840" cy="2941439"/>
+            <wp:docPr id="2" name="Picture 2"/>
+            <wp:cNvGraphicFramePr>
+              <a:graphicFrameLocks noChangeAspect="1"/>
+            </wp:cNvGraphicFramePr>
+            <a:graphic>
+              <a:graphicData uri="http://schemas.openxmlformats.org/drawingml/2006/picture">
+                <pic:pic>
+                  <pic:nvPicPr>
+                    <pic:cNvPr id="0" name="media_1790526659729.png"/>
+                    <pic:cNvPicPr/>
+                  </pic:nvPicPr>
+                  <pic:blipFill>
+                    <a:blip r:embed="rId10"/>
+                    <a:stretch>
+                      <a:fillRect/>
+                    </a:stretch>
+                  </pic:blipFill>
+                  <pic:spPr>
+                    <a:xfrm>
+                      <a:off x="0" y="0"/>
+                      <a:ext cx="5577840" cy="2941439"/>
+                    </a:xfrm>
+                    <a:prstGeom prst="rect"/>
+                  </pic:spPr>
+                </pic:pic>
+              </a:graphicData>
+            </a:graphic>
+          </wp:inline>
+        </w:drawing>
+      </w:r>
+    </w:p>
     <w:p>
       <w:pPr>
-        <w:spacing w:after="80"/>
-      </w:pPr>
+        <w:spacing w:before="40" w:after="160"/>
+        <w:jc w:val="center"/>
+      </w:pPr>
+      <w:r>
+        <w:rPr>
+          <w:rFonts w:ascii="Calibri" w:hAnsi="Calibri"/>
+          <w:i/>
+          <w:color w:val="505050"/>
+          <w:sz w:val="19"/>
+        </w:rPr>
+        <w:t>Figure 2: Response of /api/lab3/config with default profile (port 8080, no active profile)</w:t>
+      </w:r>
     </w:p>
     <w:p>
       <w:pPr>
@@ -1679,82 +1668,61 @@
         <w:t>2. Development Profile (--spring.profiles.active=dev, port 8081):</w:t>
       </w:r>
     </w:p>
-    <w:tbl>
-      <w:tblPr>
-        <w:tblW w:type="auto" w:w="0"/>
+    <w:p>
+      <w:pPr>
+        <w:keepNext/>
+        <w:spacing w:before="160" w:after="40"/>
         <w:jc w:val="center"/>
-        <w:tblLook w:firstColumn="1" w:firstRow="1" w:lastColumn="0" w:lastRow="0" w:noHBand="0" w:noVBand="1" w:val="04A0"/>
-      </w:tblPr>
-      <w:tblGrid>
-        <w:gridCol w:w="9936"/>
-      </w:tblGrid>
-      <w:tr>
-        <w:tc>
-          <w:tcPr>
-            <w:tcW w:type="dxa" w:w="9936"/>
-            <w:shd w:fill="F3F4F6"/>
-            <w:tcMar>
-              <w:top w:w="120" w:type="dxa"/>
-              <w:bottom w:w="120" w:type="dxa"/>
-              <w:left w:w="160" w:type="dxa"/>
-              <w:right w:w="160" w:type="dxa"/>
-            </w:tcMar>
-          </w:tcPr>
-          <w:p>
-            <w:pPr>
-              <w:spacing w:before="40" w:after="40" w:line="252" w:lineRule="auto"/>
-            </w:pPr>
-            <w:r>
-              <w:rPr>
-                <w:rFonts w:ascii="Consolas" w:hAnsi="Consolas"/>
-                <w:color w:val="1E293B"/>
-                <w:sz w:val="19"/>
-              </w:rPr>
-              <w:t>GET http://localhost:8081/api/lab3/config</w:t>
-              <w:br/>
-              <w:t>HTTP/1.1 200 OK</w:t>
-              <w:br/>
-              <w:t>Content-Type: application/json</w:t>
-              <w:br/>
-              <w:br/>
-              <w:t>{</w:t>
-              <w:br/>
-              <w:t xml:space="preserve">  "owner": "Akishev Adilkhan",</w:t>
-              <w:br/>
-              <w:t xml:space="preserve">  "group": "IS-2406",</w:t>
-              <w:br/>
-              <w:t xml:space="preserve">  "mailFrom": "no-reply@iitu.kz",</w:t>
-              <w:br/>
-              <w:t xml:space="preserve">  "mailRetryCount": 1,</w:t>
-              <w:br/>
-              <w:t xml:space="preserve">  "mailTimeout": "PT5S",</w:t>
-              <w:br/>
-              <w:t xml:space="preserve">  "mailEnabled": false,</w:t>
-              <w:br/>
-              <w:t xml:space="preserve">  "paginationDefaultSize": 10,</w:t>
-              <w:br/>
-              <w:t xml:space="preserve">  "paginationMaxSize": 50,</w:t>
-              <w:br/>
-              <w:t xml:space="preserve">  "serverPort": "8081",</w:t>
-              <w:br/>
-              <w:t xml:space="preserve">  "activeProfiles": [</w:t>
-              <w:br/>
-              <w:t xml:space="preserve">    "dev"</w:t>
-              <w:br/>
-              <w:t xml:space="preserve">  ],</w:t>
-              <w:br/>
-              <w:t xml:space="preserve">  "banner": "DEVELOPMENT: the data is test data"</w:t>
-              <w:br/>
-              <w:t>}</w:t>
-            </w:r>
-          </w:p>
-        </w:tc>
-      </w:tr>
-    </w:tbl>
+      </w:pPr>
+      <w:r>
+        <w:drawing>
+          <wp:inline xmlns:a="http://schemas.openxmlformats.org/drawingml/2006/main" xmlns:pic="http://schemas.openxmlformats.org/drawingml/2006/picture">
+            <wp:extent cx="5577840" cy="2946886"/>
+            <wp:docPr id="3" name="Picture 3"/>
+            <wp:cNvGraphicFramePr>
+              <a:graphicFrameLocks noChangeAspect="1"/>
+            </wp:cNvGraphicFramePr>
+            <a:graphic>
+              <a:graphicData uri="http://schemas.openxmlformats.org/drawingml/2006/picture">
+                <pic:pic>
+                  <pic:nvPicPr>
+                    <pic:cNvPr id="0" name="media_1790526848800.png"/>
+                    <pic:cNvPicPr/>
+                  </pic:nvPicPr>
+                  <pic:blipFill>
+                    <a:blip r:embed="rId11"/>
+                    <a:stretch>
+                      <a:fillRect/>
+                    </a:stretch>
+                  </pic:blipFill>
+                  <pic:spPr>
+                    <a:xfrm>
+                      <a:off x="0" y="0"/>
+                      <a:ext cx="5577840" cy="2946886"/>
+                    </a:xfrm>
+                    <a:prstGeom prst="rect"/>
+                  </pic:spPr>
+                </pic:pic>
+              </a:graphicData>
+            </a:graphic>
+          </wp:inline>
+        </w:drawing>
+      </w:r>
+    </w:p>
     <w:p>
       <w:pPr>
-        <w:spacing w:after="80"/>
-      </w:pPr>
+        <w:spacing w:before="40" w:after="160"/>
+        <w:jc w:val="center"/>
+      </w:pPr>
+      <w:r>
+        <w:rPr>
+          <w:rFonts w:ascii="Calibri" w:hAnsi="Calibri"/>
+          <w:i/>
+          <w:color w:val="505050"/>
+          <w:sz w:val="19"/>
+        </w:rPr>
+        <w:t>Figure 3: Response of /api/lab3/config with dev profile (port 8081, retryCount 1, pagination 10/50)</w:t>
+      </w:r>
     </w:p>
     <w:p>
       <w:pPr>
@@ -1777,82 +1745,61 @@
         <w:t>3. Production Profile (--spring.profiles.active=prod, port 8080):</w:t>
       </w:r>
     </w:p>
-    <w:tbl>
-      <w:tblPr>
-        <w:tblW w:type="auto" w:w="0"/>
+    <w:p>
+      <w:pPr>
+        <w:keepNext/>
+        <w:spacing w:before="160" w:after="40"/>
         <w:jc w:val="center"/>
-        <w:tblLook w:firstColumn="1" w:firstRow="1" w:lastColumn="0" w:lastRow="0" w:noHBand="0" w:noVBand="1" w:val="04A0"/>
-      </w:tblPr>
-      <w:tblGrid>
-        <w:gridCol w:w="9936"/>
-      </w:tblGrid>
-      <w:tr>
-        <w:tc>
-          <w:tcPr>
-            <w:tcW w:type="dxa" w:w="9936"/>
-            <w:shd w:fill="F3F4F6"/>
-            <w:tcMar>
-              <w:top w:w="120" w:type="dxa"/>
-              <w:bottom w:w="120" w:type="dxa"/>
-              <w:left w:w="160" w:type="dxa"/>
-              <w:right w:w="160" w:type="dxa"/>
-            </w:tcMar>
-          </w:tcPr>
-          <w:p>
-            <w:pPr>
-              <w:spacing w:before="40" w:after="40" w:line="252" w:lineRule="auto"/>
-            </w:pPr>
-            <w:r>
-              <w:rPr>
-                <w:rFonts w:ascii="Consolas" w:hAnsi="Consolas"/>
-                <w:color w:val="1E293B"/>
-                <w:sz w:val="19"/>
-              </w:rPr>
-              <w:t>GET http://localhost:8080/api/lab3/config</w:t>
-              <w:br/>
-              <w:t>HTTP/1.1 200 OK</w:t>
-              <w:br/>
-              <w:t>Content-Type: application/json</w:t>
-              <w:br/>
-              <w:br/>
-              <w:t>{</w:t>
-              <w:br/>
-              <w:t xml:space="preserve">  "owner": "Akishev Adilkhan",</w:t>
-              <w:br/>
-              <w:t xml:space="preserve">  "group": "IS-2406",</w:t>
-              <w:br/>
-              <w:t xml:space="preserve">  "mailFrom": "no-reply@iitu.kz",</w:t>
-              <w:br/>
-              <w:t xml:space="preserve">  "mailRetryCount": 5,</w:t>
-              <w:br/>
-              <w:t xml:space="preserve">  "mailTimeout": "PT5S",</w:t>
-              <w:br/>
-              <w:t xml:space="preserve">  "mailEnabled": true,</w:t>
-              <w:br/>
-              <w:t xml:space="preserve">  "paginationDefaultSize": 25,</w:t>
-              <w:br/>
-              <w:t xml:space="preserve">  "paginationMaxSize": 200,</w:t>
-              <w:br/>
-              <w:t xml:space="preserve">  "serverPort": "8080",</w:t>
-              <w:br/>
-              <w:t xml:space="preserve">  "activeProfiles": [</w:t>
-              <w:br/>
-              <w:t xml:space="preserve">    "prod"</w:t>
-              <w:br/>
-              <w:t xml:space="preserve">  ],</w:t>
-              <w:br/>
-              <w:t xml:space="preserve">  "banner": "PRODUCTION: handle with care"</w:t>
-              <w:br/>
-              <w:t>}</w:t>
-            </w:r>
-          </w:p>
-        </w:tc>
-      </w:tr>
-    </w:tbl>
+      </w:pPr>
+      <w:r>
+        <w:drawing>
+          <wp:inline xmlns:a="http://schemas.openxmlformats.org/drawingml/2006/main" xmlns:pic="http://schemas.openxmlformats.org/drawingml/2006/picture">
+            <wp:extent cx="5577840" cy="2935992"/>
+            <wp:docPr id="4" name="Picture 4"/>
+            <wp:cNvGraphicFramePr>
+              <a:graphicFrameLocks noChangeAspect="1"/>
+            </wp:cNvGraphicFramePr>
+            <a:graphic>
+              <a:graphicData uri="http://schemas.openxmlformats.org/drawingml/2006/picture">
+                <pic:pic>
+                  <pic:nvPicPr>
+                    <pic:cNvPr id="0" name="media_1790526902661.png"/>
+                    <pic:cNvPicPr/>
+                  </pic:nvPicPr>
+                  <pic:blipFill>
+                    <a:blip r:embed="rId12"/>
+                    <a:stretch>
+                      <a:fillRect/>
+                    </a:stretch>
+                  </pic:blipFill>
+                  <pic:spPr>
+                    <a:xfrm>
+                      <a:off x="0" y="0"/>
+                      <a:ext cx="5577840" cy="2935992"/>
+                    </a:xfrm>
+                    <a:prstGeom prst="rect"/>
+                  </pic:spPr>
+                </pic:pic>
+              </a:graphicData>
+            </a:graphic>
+          </wp:inline>
+        </w:drawing>
+      </w:r>
+    </w:p>
     <w:p>
       <w:pPr>
-        <w:spacing w:after="80"/>
-      </w:pPr>
+        <w:spacing w:before="40" w:after="160"/>
+        <w:jc w:val="center"/>
+      </w:pPr>
+      <w:r>
+        <w:rPr>
+          <w:rFonts w:ascii="Calibri" w:hAnsi="Calibri"/>
+          <w:i/>
+          <w:color w:val="505050"/>
+          <w:sz w:val="19"/>
+        </w:rPr>
+        <w:t>Figure 4: Response of /api/lab3/config with prod profile (port 8080, retryCount 5, pagination 25/200)</w:t>
+      </w:r>
     </w:p>
     <w:p>
       <w:pPr>
@@ -2468,88 +2415,61 @@
         <w:t>Inspecting the origin of app.mail.retry-count via /actuator/env/app.mail.retry-count:</w:t>
       </w:r>
     </w:p>
-    <w:tbl>
-      <w:tblPr>
-        <w:tblW w:type="auto" w:w="0"/>
+    <w:p>
+      <w:pPr>
+        <w:keepNext/>
+        <w:spacing w:before="160" w:after="40"/>
         <w:jc w:val="center"/>
-        <w:tblLook w:firstColumn="1" w:firstRow="1" w:lastColumn="0" w:lastRow="0" w:noHBand="0" w:noVBand="1" w:val="04A0"/>
-      </w:tblPr>
-      <w:tblGrid>
-        <w:gridCol w:w="9936"/>
-      </w:tblGrid>
-      <w:tr>
-        <w:tc>
-          <w:tcPr>
-            <w:tcW w:type="dxa" w:w="9936"/>
-            <w:shd w:fill="F3F4F6"/>
-            <w:tcMar>
-              <w:top w:w="120" w:type="dxa"/>
-              <w:bottom w:w="120" w:type="dxa"/>
-              <w:left w:w="160" w:type="dxa"/>
-              <w:right w:w="160" w:type="dxa"/>
-            </w:tcMar>
-          </w:tcPr>
-          <w:p>
-            <w:pPr>
-              <w:spacing w:before="40" w:after="40" w:line="252" w:lineRule="auto"/>
-            </w:pPr>
-            <w:r>
-              <w:rPr>
-                <w:rFonts w:ascii="Consolas" w:hAnsi="Consolas"/>
-                <w:color w:val="1E293B"/>
-                <w:sz w:val="19"/>
-              </w:rPr>
-              <w:t>GET http://localhost:8080/actuator/env/app.mail.retry-count</w:t>
-              <w:br/>
-              <w:t>HTTP/1.1 200 OK</w:t>
-              <w:br/>
-              <w:t>Content-Type: application/vnd.spring-boot.actuator.v3+json</w:t>
-              <w:br/>
-              <w:br/>
-              <w:t>{</w:t>
-              <w:br/>
-              <w:t xml:space="preserve">  "property": {</w:t>
-              <w:br/>
-              <w:t xml:space="preserve">    "source": "Config resource 'class path resource [application.yml]' via location 'optional:classpath:/'",</w:t>
-              <w:br/>
-              <w:t xml:space="preserve">    "value": "******"</w:t>
-              <w:br/>
-              <w:t xml:space="preserve">  },</w:t>
-              <w:br/>
-              <w:t xml:space="preserve">  "propertySources": [</w:t>
-              <w:br/>
-              <w:t xml:space="preserve">    { "name": "server.ports" },</w:t>
-              <w:br/>
-              <w:t xml:space="preserve">    { "name": "systemProperties" },</w:t>
-              <w:br/>
-              <w:t xml:space="preserve">    { "name": "systemEnvironment" },</w:t>
-              <w:br/>
-              <w:t xml:space="preserve">    {</w:t>
-              <w:br/>
-              <w:t xml:space="preserve">      "name": "Config resource 'class path resource [application.yml]' via location 'optional:classpath:/'",</w:t>
-              <w:br/>
-              <w:t xml:space="preserve">      "property": {</w:t>
-              <w:br/>
-              <w:t xml:space="preserve">        "origin": "class path resource [application.yml] from spring-lab-01-0.0.1-SNAPSHOT.jar - 14:18",</w:t>
-              <w:br/>
-              <w:t xml:space="preserve">        "value": "******"</w:t>
-              <w:br/>
-              <w:t xml:space="preserve">      }</w:t>
-              <w:br/>
-              <w:t xml:space="preserve">    }</w:t>
-              <w:br/>
-              <w:t xml:space="preserve">  ]</w:t>
-              <w:br/>
-              <w:t>}</w:t>
-            </w:r>
-          </w:p>
-        </w:tc>
-      </w:tr>
-    </w:tbl>
+      </w:pPr>
+      <w:r>
+        <w:drawing>
+          <wp:inline xmlns:a="http://schemas.openxmlformats.org/drawingml/2006/main" xmlns:pic="http://schemas.openxmlformats.org/drawingml/2006/picture">
+            <wp:extent cx="5577840" cy="2963228"/>
+            <wp:docPr id="5" name="Picture 5"/>
+            <wp:cNvGraphicFramePr>
+              <a:graphicFrameLocks noChangeAspect="1"/>
+            </wp:cNvGraphicFramePr>
+            <a:graphic>
+              <a:graphicData uri="http://schemas.openxmlformats.org/drawingml/2006/picture">
+                <pic:pic>
+                  <pic:nvPicPr>
+                    <pic:cNvPr id="0" name="media_1790527051850.png"/>
+                    <pic:cNvPicPr/>
+                  </pic:nvPicPr>
+                  <pic:blipFill>
+                    <a:blip r:embed="rId13"/>
+                    <a:stretch>
+                      <a:fillRect/>
+                    </a:stretch>
+                  </pic:blipFill>
+                  <pic:spPr>
+                    <a:xfrm>
+                      <a:off x="0" y="0"/>
+                      <a:ext cx="5577840" cy="2963228"/>
+                    </a:xfrm>
+                    <a:prstGeom prst="rect"/>
+                  </pic:spPr>
+                </pic:pic>
+              </a:graphicData>
+            </a:graphic>
+          </wp:inline>
+        </w:drawing>
+      </w:r>
+    </w:p>
     <w:p>
       <w:pPr>
-        <w:spacing w:after="80"/>
-      </w:pPr>
+        <w:spacing w:before="40" w:after="160"/>
+        <w:jc w:val="center"/>
+      </w:pPr>
+      <w:r>
+        <w:rPr>
+          <w:rFonts w:ascii="Calibri" w:hAnsi="Calibri"/>
+          <w:i/>
+          <w:color w:val="505050"/>
+          <w:sz w:val="19"/>
+        </w:rPr>
+        <w:t>Figure 5: Inspecting property origin via /actuator/env/app.mail.retry-count</w:t>
+      </w:r>
     </w:p>
     <w:p>
       <w:pPr>
@@ -3040,6 +2960,10 @@
                 <w:color w:val="1E293B"/>
                 <w:sz w:val="19"/>
               </w:rPr>
+              <w:t>72bac3c docs: update report with official PR #2 link</w:t>
+              <w:br/>
+              <w:t>613360a docs: add lab03 report docx and pdf</w:t>
+              <w:br/>
               <w:t>8f2174d lab03: YAML config, profiles, typed properties, actuator</w:t>
               <w:br/>
               <w:t>28944cc Complete Lab 2 requirements</w:t>
@@ -3089,6 +3013,62 @@
           <w:sz w:val="22"/>
         </w:rPr>
         <w:t>https://github.com/adilkhanakishev/spring-lab-01/pull/2</w:t>
+      </w:r>
+    </w:p>
+    <w:p>
+      <w:pPr>
+        <w:keepNext/>
+        <w:spacing w:before="160" w:after="40"/>
+        <w:jc w:val="center"/>
+      </w:pPr>
+      <w:r>
+        <w:drawing>
+          <wp:inline xmlns:a="http://schemas.openxmlformats.org/drawingml/2006/main" xmlns:pic="http://schemas.openxmlformats.org/drawingml/2006/picture">
+            <wp:extent cx="5577840" cy="2952333"/>
+            <wp:docPr id="6" name="Picture 6"/>
+            <wp:cNvGraphicFramePr>
+              <a:graphicFrameLocks noChangeAspect="1"/>
+            </wp:cNvGraphicFramePr>
+            <a:graphic>
+              <a:graphicData uri="http://schemas.openxmlformats.org/drawingml/2006/picture">
+                <pic:pic>
+                  <pic:nvPicPr>
+                    <pic:cNvPr id="0" name="media_1790527103761.png"/>
+                    <pic:cNvPicPr/>
+                  </pic:nvPicPr>
+                  <pic:blipFill>
+                    <a:blip r:embed="rId14"/>
+                    <a:stretch>
+                      <a:fillRect/>
+                    </a:stretch>
+                  </pic:blipFill>
+                  <pic:spPr>
+                    <a:xfrm>
+                      <a:off x="0" y="0"/>
+                      <a:ext cx="5577840" cy="2952333"/>
+                    </a:xfrm>
+                    <a:prstGeom prst="rect"/>
+                  </pic:spPr>
+                </pic:pic>
+              </a:graphicData>
+            </a:graphic>
+          </wp:inline>
+        </w:drawing>
+      </w:r>
+    </w:p>
+    <w:p>
+      <w:pPr>
+        <w:spacing w:before="40" w:after="160"/>
+        <w:jc w:val="center"/>
+      </w:pPr>
+      <w:r>
+        <w:rPr>
+          <w:rFonts w:ascii="Calibri" w:hAnsi="Calibri"/>
+          <w:i/>
+          <w:color w:val="505050"/>
+          <w:sz w:val="19"/>
+        </w:rPr>
+        <w:t>Figure 6: Open Pull Request #2 (lab03 -&gt; main) on GitHub</w:t>
       </w:r>
     </w:p>
     <w:p>

</xml_diff>